<commit_message>
Add 操作系统 lab3 作业3.2 priority-* 讲解 PPT 与讲稿
同步更新作业3.1报告中开发过程的描述，与讲解内容保持一致。

Co-Authored-By: Claude Opus 5.5 <noreply@anthropic.com>
</commit_message>
<xml_diff>
--- a/操作系统lab/lab3/作业3.1实验报告.docx
+++ b/操作系统lab/lab3/作业3.1实验报告.docx
@@ -2038,7 +2038,7 @@
           <w:rFonts w:ascii="Times New Roman" w:hAnsi="Times New Roman" w:eastAsia="宋体"/>
           <w:sz w:val="21"/>
         </w:rPr>
-        <w:t xml:space="preserve">，这样同优先级之间仍然是 FIFO 轮转。如果写成 </w:t>
+        <w:t xml:space="preserve">，这样同优先级之间仍然是 FIFO 轮转。我一开始就把它写成了 </w:t>
       </w:r>
       <w:r>
         <w:rPr>
@@ -2053,7 +2053,7 @@
           <w:rFonts w:ascii="Times New Roman" w:hAnsi="Times New Roman" w:eastAsia="宋体"/>
           <w:sz w:val="21"/>
         </w:rPr>
-        <w:t xml:space="preserve"> 会怎样，我在 7.2 节专门试了一下，结果很直观。</w:t>
+        <w:t>，当时的现象见 7.2 节的 ①。</w:t>
       </w:r>
     </w:p>
     <w:p>
@@ -6411,7 +6411,7 @@
           <w:rFonts w:ascii="Times New Roman" w:hAnsi="Times New Roman" w:eastAsia="宋体"/>
           <w:sz w:val="21"/>
         </w:rPr>
-        <w:t>27 个测试全过了以后，我反而有点不踏实：有些地方是照着文档“应该这样写”写上去的，不知道它到底管不管用。于是做了一组退化实验——</w:t>
+        <w:t>开发过程中我真正踩过其中几个坑：比较函数一开始多写了等号（①）；捐赠第一版只捐给直接持有者、放锁时直接恢复 base_priority（⑤⑥），一下挂了 donate-multiple、multiple2、nest、chain 四个；最后剩下 donate-sema 一个红灯，卡得最久（③）。27 个测试全过了以后，我又有点不踏实：还有些地方是照着文档“应该这样写”写上去的，不知道它到底管不管用。于是把踩过的坑连同其他几处修改一起做了一组退化实验——</w:t>
       </w:r>
       <w:r>
         <w:rPr>

</xml_diff>